<commit_message>
chore(skills): encurta comandos — /sobreaviso e /hospitais
</commit_message>
<xml_diff>
--- a/Colaboradores/LEIA-ME-ESCALAS.docx
+++ b/Colaboradores/LEIA-ME-ESCALAS.docx
@@ -104,7 +104,7 @@
           <w:sz-cs w:val="26"/>
           <w:spacing w:val="0"/>
         </w:rPr>
-        <w:t xml:space="preserve">/importar-sobreaviso-materno</w:t>
+        <w:t xml:space="preserve">/sobreaviso</w:t>
       </w:r>
       <w:r>
         <w:rPr>
@@ -158,7 +158,7 @@
           <w:sz-cs w:val="26"/>
           <w:spacing w:val="0"/>
         </w:rPr>
-        <w:t xml:space="preserve">/importar-escala-fds-hospitais</w:t>
+        <w:t xml:space="preserve">/hospitais</w:t>
       </w:r>
       <w:r>
         <w:rPr>
@@ -640,7 +640,7 @@
           <w:sz-cs w:val="29"/>
           <w:spacing w:val="0"/>
         </w:rPr>
-        <w:t xml:space="preserve">/importar-sobreaviso-materno</w:t>
+        <w:t xml:space="preserve">/sobreaviso</w:t>
       </w:r>
     </w:p>
     <w:p>
@@ -666,7 +666,7 @@
           <w:sz-cs w:val="29"/>
           <w:spacing w:val="0"/>
         </w:rPr>
-        <w:t xml:space="preserve">/importar-escala-fds-hospitais</w:t>
+        <w:t xml:space="preserve">/hospitais</w:t>
       </w:r>
     </w:p>
     <w:p>

</xml_diff>